<commit_message>
Updated serious business hiring status
</commit_message>
<xml_diff>
--- a/JobOpenings.docx
+++ b/JobOpenings.docx
@@ -1,6 +1,6 @@
 
 <file path=word/document.xml><?xml version="1.0" encoding="utf-8"?>
-<w:document xmlns:wpc="http://schemas.microsoft.com/office/word/2010/wordprocessingCanvas" xmlns:cx="http://schemas.microsoft.com/office/drawing/2014/chartex" xmlns:cx1="http://schemas.microsoft.com/office/drawing/2015/9/8/chartex" xmlns:cx2="http://schemas.microsoft.com/office/drawing/2015/10/21/chartex" xmlns:cx3="http://schemas.microsoft.com/office/drawing/2016/5/9/chartex" xmlns:cx4="http://schemas.microsoft.com/office/drawing/2016/5/10/chartex" xmlns:cx5="http://schemas.microsoft.com/office/drawing/2016/5/11/chartex" xmlns:cx6="http://schemas.microsoft.com/office/drawing/2016/5/12/chartex" xmlns:cx7="http://schemas.microsoft.com/office/drawing/2016/5/13/chartex" xmlns:cx8="http://schemas.microsoft.com/office/drawing/2016/5/14/chartex" xmlns:mc="http://schemas.openxmlformats.org/markup-compatibility/2006" xmlns:aink="http://schemas.microsoft.com/office/drawing/2016/ink" xmlns:am3d="http://schemas.microsoft.com/office/drawing/2017/model3d" xmlns:o="urn:schemas-microsoft-com:office:office" xmlns:r="http://schemas.openxmlformats.org/officeDocument/2006/relationships" xmlns:m="http://schemas.openxmlformats.org/officeDocument/2006/math" xmlns:v="urn:schemas-microsoft-com:vml" xmlns:wp14="http://schemas.microsoft.com/office/word/2010/wordprocessingDrawing" xmlns:wp="http://schemas.openxmlformats.org/drawingml/2006/wordprocessingDrawing" xmlns:w10="urn:schemas-microsoft-com:office:word" xmlns:w="http://schemas.openxmlformats.org/wordprocessingml/2006/main" xmlns:w14="http://schemas.microsoft.com/office/word/2010/wordml" xmlns:w15="http://schemas.microsoft.com/office/word/2012/wordml" xmlns:w16cid="http://schemas.microsoft.com/office/word/2016/wordml/cid" xmlns:w16se="http://schemas.microsoft.com/office/word/2015/wordml/symex" xmlns:wpg="http://schemas.microsoft.com/office/word/2010/wordprocessingGroup" xmlns:wpi="http://schemas.microsoft.com/office/word/2010/wordprocessingInk" xmlns:wne="http://schemas.microsoft.com/office/word/2006/wordml" xmlns:wps="http://schemas.microsoft.com/office/word/2010/wordprocessingShape" mc:Ignorable="w14 w15 w16se w16cid wp14">
+<w:document xmlns:wpc="http://schemas.microsoft.com/office/word/2010/wordprocessingCanvas" xmlns:cx="http://schemas.microsoft.com/office/drawing/2014/chartex" xmlns:cx1="http://schemas.microsoft.com/office/drawing/2015/9/8/chartex" xmlns:cx2="http://schemas.microsoft.com/office/drawing/2015/10/21/chartex" xmlns:cx3="http://schemas.microsoft.com/office/drawing/2016/5/9/chartex" xmlns:cx4="http://schemas.microsoft.com/office/drawing/2016/5/10/chartex" xmlns:cx5="http://schemas.microsoft.com/office/drawing/2016/5/11/chartex" xmlns:cx6="http://schemas.microsoft.com/office/drawing/2016/5/12/chartex" xmlns:cx7="http://schemas.microsoft.com/office/drawing/2016/5/13/chartex" xmlns:cx8="http://schemas.microsoft.com/office/drawing/2016/5/14/chartex" xmlns:mc="http://schemas.openxmlformats.org/markup-compatibility/2006" xmlns:aink="http://schemas.microsoft.com/office/drawing/2016/ink" xmlns:am3d="http://schemas.microsoft.com/office/drawing/2017/model3d" xmlns:o="urn:schemas-microsoft-com:office:office" xmlns:oel="http://schemas.microsoft.com/office/2019/extlst" xmlns:r="http://schemas.openxmlformats.org/officeDocument/2006/relationships" xmlns:m="http://schemas.openxmlformats.org/officeDocument/2006/math" xmlns:v="urn:schemas-microsoft-com:vml" xmlns:wp14="http://schemas.microsoft.com/office/word/2010/wordprocessingDrawing" xmlns:wp="http://schemas.openxmlformats.org/drawingml/2006/wordprocessingDrawing" xmlns:w10="urn:schemas-microsoft-com:office:word" xmlns:w="http://schemas.openxmlformats.org/wordprocessingml/2006/main" xmlns:w14="http://schemas.microsoft.com/office/word/2010/wordml" xmlns:w15="http://schemas.microsoft.com/office/word/2012/wordml" xmlns:w16cex="http://schemas.microsoft.com/office/word/2018/wordml/cex" xmlns:w16cid="http://schemas.microsoft.com/office/word/2016/wordml/cid" xmlns:w16="http://schemas.microsoft.com/office/word/2018/wordml" xmlns:w16du="http://schemas.microsoft.com/office/word/2023/wordml/word16du" xmlns:w16sdtdh="http://schemas.microsoft.com/office/word/2020/wordml/sdtdatahash" xmlns:w16sdtfl="http://schemas.microsoft.com/office/word/2024/wordml/sdtformatlock" xmlns:w16se="http://schemas.microsoft.com/office/word/2015/wordml/symex" xmlns:wpg="http://schemas.microsoft.com/office/word/2010/wordprocessingGroup" xmlns:wpi="http://schemas.microsoft.com/office/word/2010/wordprocessingInk" xmlns:wne="http://schemas.microsoft.com/office/word/2006/wordml" xmlns:wps="http://schemas.microsoft.com/office/word/2010/wordprocessingShape" mc:Ignorable="w14 w15 w16se w16cid w16 w16cex w16sdtdh w16sdtfl w16du wp14">
   <w:body>
     <w:p>
       <w:pPr>
@@ -70,29 +70,28 @@
         </w:numPr>
       </w:pPr>
       <w:r>
-        <w:t>Carbon Copy (CC:)</w:t>
-      </w:r>
-      <w:r>
-        <w:t xml:space="preserve"> </w:t>
+        <w:rPr>
+          <w:lang w:val="fr-FR"/>
+        </w:rPr>
+        <w:t xml:space="preserve">Carbon Copy (CC:) </w:t>
       </w:r>
       <w:hyperlink r:id="rId5" w:history="1">
         <w:r>
           <w:rPr>
             <w:rStyle w:val="Hyperlink"/>
+            <w:lang w:val="fr-FR"/>
           </w:rPr>
           <w:t>csmith@ytech.edu</w:t>
         </w:r>
       </w:hyperlink>
       <w:r>
-        <w:t xml:space="preserve"> . Applications not </w:t>
-      </w:r>
-      <w:proofErr w:type="spellStart"/>
-      <w:r>
-        <w:t>CC’d</w:t>
-      </w:r>
-      <w:proofErr w:type="spellEnd"/>
-      <w:r>
-        <w:t xml:space="preserve"> to the instructor will not be considered</w:t>
+        <w:rPr>
+          <w:lang w:val="fr-FR"/>
+        </w:rPr>
+        <w:t xml:space="preserve"> . </w:t>
+      </w:r>
+      <w:r>
+        <w:t>Applications not CC’d to the instructor will not be considered</w:t>
       </w:r>
     </w:p>
     <w:p>
@@ -196,66 +195,18 @@
       <w:pPr>
         <w:pStyle w:val="Heading1"/>
       </w:pPr>
-      <w:proofErr w:type="spellStart"/>
-      <w:r>
-        <w:lastRenderedPageBreak/>
+      <w:r>
         <w:t>Formbar</w:t>
       </w:r>
-      <w:proofErr w:type="spellEnd"/>
-    </w:p>
-    <w:p>
-      <w:proofErr w:type="spellStart"/>
-      <w:r>
-        <w:t>Formbar</w:t>
-      </w:r>
-      <w:proofErr w:type="spellEnd"/>
-      <w:r>
-        <w:t xml:space="preserve"> is the flagship software of the classroom. </w:t>
-      </w:r>
-      <w:proofErr w:type="spellStart"/>
-      <w:r>
-        <w:t>Formbar</w:t>
-      </w:r>
-      <w:proofErr w:type="spellEnd"/>
-      <w:r>
-        <w:t xml:space="preserve"> employees bear an incredible responsibility, and must not only be strong coders, but also of strong character. Overtime, on-call work, and mentorship is expected. Members of </w:t>
-      </w:r>
-      <w:proofErr w:type="spellStart"/>
-      <w:r>
-        <w:t>Formbar</w:t>
-      </w:r>
-      <w:proofErr w:type="spellEnd"/>
-      <w:r>
-        <w:t xml:space="preserve"> want to make an impact on their world, and are concerned with the legacy they leave behind in </w:t>
-      </w:r>
-      <w:proofErr w:type="spellStart"/>
-      <w:r>
-        <w:t>Ytech</w:t>
-      </w:r>
-      <w:proofErr w:type="spellEnd"/>
-      <w:r>
-        <w:t xml:space="preserve">. </w:t>
-      </w:r>
-      <w:proofErr w:type="spellStart"/>
-      <w:r>
-        <w:t>Formbar</w:t>
-      </w:r>
-      <w:proofErr w:type="spellEnd"/>
-      <w:r>
-        <w:t xml:space="preserve"> employees are rewarded by being put on the career fast track, gaining recommendations for applications to colleges and jobs.</w:t>
-      </w:r>
-    </w:p>
-    <w:p>
-      <w:r>
-        <w:t xml:space="preserve">Applicants should expect to become experts in project management and teamwork, documentation, web application conventions (API, HTTP, </w:t>
-      </w:r>
-      <w:proofErr w:type="spellStart"/>
-      <w:r>
-        <w:t>websockets</w:t>
-      </w:r>
-      <w:proofErr w:type="spellEnd"/>
-      <w:r>
-        <w:t>, security, UI development).</w:t>
+    </w:p>
+    <w:p>
+      <w:r>
+        <w:t>Formbar is the flagship software of the classroom. Formbar employees bear an incredible responsibility, and must not only be strong coders, but also of strong character. Overtime, on-call work, and mentorship is expected. Members of Formbar want to make an impact on their world, and are concerned with the legacy they leave behind in Ytech. Formbar employees are rewarded by being put on the career fast track, gaining recommendations for applications to colleges and jobs.</w:t>
+      </w:r>
+    </w:p>
+    <w:p>
+      <w:r>
+        <w:t>Applicants should expect to become experts in project management and teamwork, documentation, web application conventions (API, HTTP, websockets, security, UI development).</w:t>
       </w:r>
     </w:p>
     <w:p>
@@ -330,74 +281,18 @@
       <w:pPr>
         <w:pStyle w:val="Heading1"/>
       </w:pPr>
-      <w:proofErr w:type="spellStart"/>
-      <w:r>
-        <w:lastRenderedPageBreak/>
+      <w:r>
         <w:t>eBanks</w:t>
       </w:r>
-      <w:proofErr w:type="spellEnd"/>
-    </w:p>
-    <w:p>
-      <w:r>
-        <w:t xml:space="preserve">Founded by fictitious benefactor, Matthew E. Banks, </w:t>
-      </w:r>
-      <w:proofErr w:type="spellStart"/>
-      <w:r>
-        <w:t>eBanks</w:t>
-      </w:r>
-      <w:proofErr w:type="spellEnd"/>
-      <w:r>
-        <w:t xml:space="preserve"> serves to provide all of your </w:t>
-      </w:r>
-      <w:proofErr w:type="spellStart"/>
-      <w:r>
-        <w:t>digipog</w:t>
-      </w:r>
-      <w:proofErr w:type="spellEnd"/>
-      <w:r>
-        <w:t xml:space="preserve"> or </w:t>
-      </w:r>
-      <w:proofErr w:type="spellStart"/>
-      <w:r>
-        <w:t>physipog</w:t>
-      </w:r>
-      <w:proofErr w:type="spellEnd"/>
-      <w:r>
-        <w:t xml:space="preserve"> transactional needs.</w:t>
-      </w:r>
-    </w:p>
-    <w:p>
-      <w:proofErr w:type="spellStart"/>
-      <w:r>
-        <w:t>eBanks</w:t>
-      </w:r>
-      <w:proofErr w:type="spellEnd"/>
-      <w:r>
-        <w:t xml:space="preserve"> is a software project that interfaces heavily with </w:t>
-      </w:r>
-      <w:proofErr w:type="spellStart"/>
-      <w:r>
-        <w:t>IRLTech’s</w:t>
-      </w:r>
-      <w:proofErr w:type="spellEnd"/>
-      <w:r>
-        <w:t xml:space="preserve"> </w:t>
-      </w:r>
-      <w:proofErr w:type="spellStart"/>
-      <w:r>
-        <w:t>Pog</w:t>
-      </w:r>
-      <w:proofErr w:type="spellEnd"/>
-      <w:r>
-        <w:t xml:space="preserve"> ATM. The system will allow users to take out loans, repay them, write checks to other users, and develop more features as the </w:t>
-      </w:r>
-      <w:proofErr w:type="spellStart"/>
-      <w:r>
-        <w:t>Formbar</w:t>
-      </w:r>
-      <w:proofErr w:type="spellEnd"/>
-      <w:r>
-        <w:t xml:space="preserve"> project grows.</w:t>
+    </w:p>
+    <w:p>
+      <w:r>
+        <w:t>Founded by fictitious benefactor, Matthew E. Banks, eBanks serves to provide all of your digipog or physipog transactional needs.</w:t>
+      </w:r>
+    </w:p>
+    <w:p>
+      <w:r>
+        <w:t>eBanks is a software project that interfaces heavily with IRLTech’s Pog ATM. The system will allow users to take out loans, repay them, write checks to other users, and develop more features as the Formbar project grows.</w:t>
       </w:r>
     </w:p>
     <w:p>
@@ -414,15 +309,7 @@
         </w:numPr>
       </w:pPr>
       <w:r>
-        <w:t xml:space="preserve">Matthew </w:t>
-      </w:r>
-      <w:proofErr w:type="spellStart"/>
-      <w:r>
-        <w:t>Walizer</w:t>
-      </w:r>
-      <w:proofErr w:type="spellEnd"/>
-      <w:r>
-        <w:t>, Senior Developer</w:t>
+        <w:t>Matthew Walizer, Senior Developer</w:t>
       </w:r>
     </w:p>
     <w:p>
@@ -476,42 +363,26 @@
       <w:pPr>
         <w:pStyle w:val="Heading1"/>
       </w:pPr>
-      <w:proofErr w:type="spellStart"/>
-      <w:r>
-        <w:lastRenderedPageBreak/>
+      <w:r>
         <w:t>IRLTech</w:t>
       </w:r>
-      <w:proofErr w:type="spellEnd"/>
-    </w:p>
-    <w:p>
-      <w:proofErr w:type="spellStart"/>
-      <w:r>
-        <w:t>IRLTech</w:t>
-      </w:r>
-      <w:proofErr w:type="spellEnd"/>
-      <w:r>
-        <w:t xml:space="preserve"> is for pioneers and self-driven employees. Employees must be able to blaze trails outside the normal classroom work, teaching themselves the black magics of microcontrollers and digital electronics.</w:t>
+    </w:p>
+    <w:p>
+      <w:r>
+        <w:t>IRLTech is for pioneers and self-driven employees. Employees must be able to blaze trails outside the normal classroom work, teaching themselves the black magics of microcontrollers and digital electronics.</w:t>
       </w:r>
     </w:p>
     <w:p>
       <w:r>
         <w:t xml:space="preserve">Applicants should expect to learn to </w:t>
       </w:r>
-      <w:proofErr w:type="spellStart"/>
       <w:proofErr w:type="gramStart"/>
       <w:r>
         <w:t>solder,safely</w:t>
       </w:r>
-      <w:proofErr w:type="spellEnd"/>
       <w:proofErr w:type="gramEnd"/>
       <w:r>
-        <w:t xml:space="preserve"> handle electricity, write firmware – mostly in C++ </w:t>
-      </w:r>
-      <w:r>
-        <w:t>–</w:t>
-      </w:r>
-      <w:r>
-        <w:t xml:space="preserve"> and find and read documentation on the subject.</w:t>
+        <w:t xml:space="preserve"> handle electricity, write firmware – mostly in C++ – and find and read documentation on the subject.</w:t>
       </w:r>
     </w:p>
     <w:p>
@@ -528,15 +399,7 @@
         </w:numPr>
       </w:pPr>
       <w:r>
-        <w:t xml:space="preserve">Matthew </w:t>
-      </w:r>
-      <w:proofErr w:type="spellStart"/>
-      <w:r>
-        <w:t>Walizer</w:t>
-      </w:r>
-      <w:proofErr w:type="spellEnd"/>
-      <w:r>
-        <w:t>, Senior Engineer</w:t>
+        <w:t>Matthew Walizer, Senior Engineer</w:t>
       </w:r>
     </w:p>
     <w:p>
@@ -565,21 +428,12 @@
         </w:numPr>
       </w:pPr>
       <w:r>
-        <w:t>1</w:t>
-      </w:r>
-      <w:r>
-        <w:t xml:space="preserve"> Junior Engineer</w:t>
-      </w:r>
-    </w:p>
-    <w:p>
-      <w:r>
-        <w:t xml:space="preserve">To Apply, contact a Senior </w:t>
-      </w:r>
-      <w:r>
-        <w:t>E</w:t>
-      </w:r>
-      <w:r>
-        <w:t>ngineer.</w:t>
+        <w:t>1 Junior Engineer</w:t>
+      </w:r>
+    </w:p>
+    <w:p>
+      <w:r>
+        <w:t>To Apply, contact a Senior Engineer.</w:t>
       </w:r>
     </w:p>
     <w:p>
@@ -591,24 +445,13 @@
       <w:pPr>
         <w:pStyle w:val="Heading1"/>
       </w:pPr>
-      <w:proofErr w:type="spellStart"/>
-      <w:r>
-        <w:lastRenderedPageBreak/>
+      <w:r>
         <w:t>Gamebar</w:t>
       </w:r>
-      <w:proofErr w:type="spellEnd"/>
-    </w:p>
-    <w:p>
-      <w:r>
-        <w:t xml:space="preserve">coolmathgames.com, except Mr. Smith doesn’t yell at you because it costs </w:t>
-      </w:r>
-      <w:proofErr w:type="spellStart"/>
-      <w:r>
-        <w:t>pogs</w:t>
-      </w:r>
-      <w:proofErr w:type="spellEnd"/>
-      <w:r>
-        <w:t xml:space="preserve"> and he got a cut.</w:t>
+    </w:p>
+    <w:p>
+      <w:r>
+        <w:t>coolmathgames.com, except Mr. Smith doesn’t yell at you because it costs pogs and he got a cut.</w:t>
       </w:r>
     </w:p>
     <w:p>
@@ -630,10 +473,7 @@
         </w:numPr>
       </w:pPr>
       <w:r>
-        <w:t>Kris Bowman</w:t>
-      </w:r>
-      <w:r>
-        <w:t>, Project Lead</w:t>
+        <w:t>Kris Bowman, Project Lead</w:t>
       </w:r>
     </w:p>
     <w:p>
@@ -645,10 +485,7 @@
         </w:numPr>
       </w:pPr>
       <w:r>
-        <w:t>Chris Martin</w:t>
-      </w:r>
-      <w:r>
-        <w:t>, Senior Developer</w:t>
+        <w:t>Chris Martin, Senior Developer</w:t>
       </w:r>
     </w:p>
     <w:p>
@@ -665,13 +502,7 @@
         </w:numPr>
       </w:pPr>
       <w:r>
-        <w:t>2</w:t>
-      </w:r>
-      <w:r>
-        <w:t xml:space="preserve"> Junior Developers</w:t>
-      </w:r>
-      <w:r>
-        <w:t>,</w:t>
+        <w:t>2 Junior Developers,</w:t>
       </w:r>
       <w:r>
         <w:rPr>
@@ -703,7 +534,6 @@
         <w:pStyle w:val="Heading1"/>
       </w:pPr>
       <w:r>
-        <w:lastRenderedPageBreak/>
         <w:t>RGB Gamers</w:t>
       </w:r>
     </w:p>
@@ -721,23 +551,7 @@
         <w:t>Gamers</w:t>
       </w:r>
       <w:r>
-        <w:t xml:space="preserve">. Games that are designed to be fun outside of the classroom, using classic engines such as Unity, Unreal, Godot, </w:t>
-      </w:r>
-      <w:proofErr w:type="spellStart"/>
-      <w:r>
-        <w:t>Monogame</w:t>
-      </w:r>
-      <w:proofErr w:type="spellEnd"/>
-      <w:r>
-        <w:t xml:space="preserve">, etc. Initially with the goal of selling access for </w:t>
-      </w:r>
-      <w:proofErr w:type="spellStart"/>
-      <w:r>
-        <w:t>pogs</w:t>
-      </w:r>
-      <w:proofErr w:type="spellEnd"/>
-      <w:r>
-        <w:t>, and a final goal of publishing on platforms like Steam and Nintendo Switch.</w:t>
+        <w:t>. Games that are designed to be fun outside of the classroom, using classic engines such as Unity, Unreal, Godot, Monogame, etc. Initially with the goal of selling access for pogs, and a final goal of publishing on platforms like Steam and Nintendo Switch.</w:t>
       </w:r>
     </w:p>
     <w:p>
@@ -842,29 +656,12 @@
         <w:pStyle w:val="Heading1"/>
       </w:pPr>
       <w:r>
-        <w:lastRenderedPageBreak/>
         <w:t>Serious Business</w:t>
       </w:r>
     </w:p>
     <w:p>
       <w:r>
-        <w:t xml:space="preserve">Serious Business take on jobs that benefit the class within its place in the school. Serious Business is in charge of developing </w:t>
-      </w:r>
-      <w:proofErr w:type="spellStart"/>
-      <w:r>
-        <w:t>Jobbar</w:t>
-      </w:r>
-      <w:proofErr w:type="spellEnd"/>
-      <w:r>
-        <w:t xml:space="preserve">, which seeks to replace the document you are reading now, but also works as systems integrators for clients outside of the classroom. For example, an upcoming project is to set up a </w:t>
-      </w:r>
-      <w:proofErr w:type="spellStart"/>
-      <w:r>
-        <w:t>Wordpress</w:t>
-      </w:r>
-      <w:proofErr w:type="spellEnd"/>
-      <w:r>
-        <w:t xml:space="preserve"> for the SkillsUSA competition the school is hosting.</w:t>
+        <w:t>Serious Business take on jobs that benefit the class within its place in the school. Serious Business is in charge of developing Jobbar, which seeks to replace the document you are reading now, but also works as systems integrators for clients outside of the classroom. For example, an upcoming project is to set up a Wordpress for the SkillsUSA competition the school is hosting.</w:t>
       </w:r>
     </w:p>
     <w:p>
@@ -903,40 +700,28 @@
       </w:r>
     </w:p>
     <w:p>
-      <w:r>
-        <w:t>This project is looking to hire:</w:t>
-      </w:r>
-    </w:p>
-    <w:p>
-      <w:pPr>
-        <w:pStyle w:val="ListParagraph"/>
-        <w:numPr>
-          <w:ilvl w:val="0"/>
-          <w:numId w:val="9"/>
-        </w:numPr>
-      </w:pPr>
-      <w:r>
-        <w:t xml:space="preserve">2 </w:t>
-      </w:r>
-      <w:r>
-        <w:rPr>
-          <w:i/>
-        </w:rPr>
-        <w:t xml:space="preserve">Seniors serving as </w:t>
-      </w:r>
-      <w:r>
-        <w:rPr>
-          <w:i/>
-        </w:rPr>
-        <w:t>Junior Developers</w:t>
-      </w:r>
-    </w:p>
-    <w:p>
-      <w:r>
-        <w:t>To Apply, contact the Project Lead.</w:t>
-      </w:r>
-    </w:p>
-    <w:p>
+      <w:pPr>
+        <w:pStyle w:val="ListParagraph"/>
+        <w:numPr>
+          <w:ilvl w:val="0"/>
+          <w:numId w:val="8"/>
+        </w:numPr>
+      </w:pPr>
+      <w:r>
+        <w:t>Markus Owens, Junior Developer</w:t>
+      </w:r>
+    </w:p>
+    <w:p>
+      <w:pPr>
+        <w:pStyle w:val="ListParagraph"/>
+        <w:numPr>
+          <w:ilvl w:val="0"/>
+          <w:numId w:val="8"/>
+        </w:numPr>
+      </w:pPr>
+      <w:r>
+        <w:t>Kayden LaRosa, Junior Developer</w:t>
+      </w:r>
       <w:r>
         <w:br w:type="page"/>
       </w:r>
@@ -945,21 +730,13 @@
       <w:pPr>
         <w:pStyle w:val="Heading1"/>
       </w:pPr>
-      <w:proofErr w:type="spellStart"/>
-      <w:r>
-        <w:lastRenderedPageBreak/>
+      <w:r>
         <w:t>AuxCable</w:t>
       </w:r>
-      <w:proofErr w:type="spellEnd"/>
-    </w:p>
-    <w:p>
-      <w:proofErr w:type="spellStart"/>
-      <w:r>
-        <w:t>AuxCable</w:t>
-      </w:r>
-      <w:proofErr w:type="spellEnd"/>
-      <w:r>
-        <w:t xml:space="preserve"> specializes in making 3</w:t>
+    </w:p>
+    <w:p>
+      <w:r>
+        <w:t>AuxCable specializes in making 3</w:t>
       </w:r>
       <w:r>
         <w:rPr>
@@ -968,37 +745,8 @@
         <w:t>rd</w:t>
       </w:r>
       <w:r>
-        <w:t xml:space="preserve"> party applications from </w:t>
-      </w:r>
-      <w:proofErr w:type="spellStart"/>
-      <w:r>
-        <w:t>Formbar</w:t>
-      </w:r>
-      <w:proofErr w:type="spellEnd"/>
-      <w:r>
-        <w:t xml:space="preserve"> API. Currently, </w:t>
-      </w:r>
-      <w:proofErr w:type="spellStart"/>
-      <w:r>
-        <w:t>AuxCable</w:t>
-      </w:r>
-      <w:proofErr w:type="spellEnd"/>
-      <w:r>
-        <w:t xml:space="preserve"> is responsible for </w:t>
-      </w:r>
-      <w:proofErr w:type="spellStart"/>
-      <w:r>
-        <w:t>Jukebar</w:t>
-      </w:r>
-      <w:proofErr w:type="spellEnd"/>
-      <w:r>
-        <w:t xml:space="preserve"> and </w:t>
-      </w:r>
-      <w:proofErr w:type="spellStart"/>
-      <w:r>
-        <w:t>FormPix</w:t>
-      </w:r>
-      <w:proofErr w:type="spellEnd"/>
+        <w:t xml:space="preserve"> party applications from Formbar API. Currently, AuxCable is responsible for Jukebar and FormPix</w:t>
+      </w:r>
       <w:r>
         <w:t>.</w:t>
       </w:r>
@@ -1089,37 +837,12 @@
         <w:pStyle w:val="Heading1"/>
       </w:pPr>
       <w:r>
-        <w:lastRenderedPageBreak/>
         <w:t>MP Gamers</w:t>
       </w:r>
     </w:p>
     <w:p>
       <w:r>
-        <w:t xml:space="preserve">MP Gamers </w:t>
-      </w:r>
-      <w:proofErr w:type="spellStart"/>
-      <w:r>
-        <w:t>developes</w:t>
-      </w:r>
-      <w:proofErr w:type="spellEnd"/>
-      <w:r>
-        <w:t xml:space="preserve"> </w:t>
-      </w:r>
-      <w:proofErr w:type="spellStart"/>
-      <w:r>
-        <w:t>Formbar</w:t>
-      </w:r>
-      <w:proofErr w:type="spellEnd"/>
-      <w:r>
-        <w:t xml:space="preserve"> games that are multiplayer and take longer sessions, such as </w:t>
-      </w:r>
-      <w:proofErr w:type="spellStart"/>
-      <w:r>
-        <w:t>Onebar</w:t>
-      </w:r>
-      <w:proofErr w:type="spellEnd"/>
-      <w:r>
-        <w:t>.</w:t>
+        <w:t>MP Gamers developes Formbar games that are multiplayer and take longer sessions, such as Onebar.</w:t>
       </w:r>
     </w:p>
     <w:p>
@@ -1173,31 +896,13 @@
       <w:pPr>
         <w:pStyle w:val="Heading1"/>
       </w:pPr>
-      <w:bookmarkStart w:id="0" w:name="_GoBack"/>
-      <w:bookmarkEnd w:id="0"/>
-      <w:proofErr w:type="spellStart"/>
-      <w:r>
-        <w:lastRenderedPageBreak/>
+      <w:r>
         <w:t>Pogglebar</w:t>
       </w:r>
-      <w:proofErr w:type="spellEnd"/>
-    </w:p>
-    <w:p>
-      <w:proofErr w:type="spellStart"/>
-      <w:r>
-        <w:t>Pogglebar</w:t>
-      </w:r>
-      <w:proofErr w:type="spellEnd"/>
-      <w:r>
-        <w:t xml:space="preserve"> develops </w:t>
-      </w:r>
-      <w:proofErr w:type="spellStart"/>
-      <w:r>
-        <w:t>Pogglebar</w:t>
-      </w:r>
-      <w:proofErr w:type="spellEnd"/>
-      <w:r>
-        <w:t>. This company is not hiring.</w:t>
+    </w:p>
+    <w:p>
+      <w:r>
+        <w:t>Pogglebar develops Pogglebar. This company is not hiring.</w:t>
       </w:r>
     </w:p>
     <w:p>
@@ -1214,10 +919,7 @@
         </w:numPr>
       </w:pPr>
       <w:r>
-        <w:t>Carter Quickel</w:t>
-      </w:r>
-      <w:r>
-        <w:t>, Project Lead</w:t>
+        <w:t>Carter Quickel, Project Lead</w:t>
       </w:r>
     </w:p>
     <w:p>
@@ -1229,10 +931,7 @@
         </w:numPr>
       </w:pPr>
       <w:r>
-        <w:t>Vincent Liu</w:t>
-      </w:r>
-      <w:r>
-        <w:t>, Senior Developer</w:t>
+        <w:t>Vincent Liu, Senior Developer</w:t>
       </w:r>
     </w:p>
     <w:p/>
@@ -1251,7 +950,7 @@
 </file>
 
 <file path=word/numbering.xml><?xml version="1.0" encoding="utf-8"?>
-<w:numbering xmlns:wpc="http://schemas.microsoft.com/office/word/2010/wordprocessingCanvas" xmlns:cx="http://schemas.microsoft.com/office/drawing/2014/chartex" xmlns:cx1="http://schemas.microsoft.com/office/drawing/2015/9/8/chartex" xmlns:cx2="http://schemas.microsoft.com/office/drawing/2015/10/21/chartex" xmlns:cx3="http://schemas.microsoft.com/office/drawing/2016/5/9/chartex" xmlns:cx4="http://schemas.microsoft.com/office/drawing/2016/5/10/chartex" xmlns:cx5="http://schemas.microsoft.com/office/drawing/2016/5/11/chartex" xmlns:cx6="http://schemas.microsoft.com/office/drawing/2016/5/12/chartex" xmlns:cx7="http://schemas.microsoft.com/office/drawing/2016/5/13/chartex" xmlns:cx8="http://schemas.microsoft.com/office/drawing/2016/5/14/chartex" xmlns:mc="http://schemas.openxmlformats.org/markup-compatibility/2006" xmlns:aink="http://schemas.microsoft.com/office/drawing/2016/ink" xmlns:am3d="http://schemas.microsoft.com/office/drawing/2017/model3d" xmlns:o="urn:schemas-microsoft-com:office:office" xmlns:r="http://schemas.openxmlformats.org/officeDocument/2006/relationships" xmlns:m="http://schemas.openxmlformats.org/officeDocument/2006/math" xmlns:v="urn:schemas-microsoft-com:vml" xmlns:wp14="http://schemas.microsoft.com/office/word/2010/wordprocessingDrawing" xmlns:wp="http://schemas.openxmlformats.org/drawingml/2006/wordprocessingDrawing" xmlns:w10="urn:schemas-microsoft-com:office:word" xmlns:w="http://schemas.openxmlformats.org/wordprocessingml/2006/main" xmlns:w14="http://schemas.microsoft.com/office/word/2010/wordml" xmlns:w15="http://schemas.microsoft.com/office/word/2012/wordml" xmlns:w16cid="http://schemas.microsoft.com/office/word/2016/wordml/cid" xmlns:w16se="http://schemas.microsoft.com/office/word/2015/wordml/symex" xmlns:wpg="http://schemas.microsoft.com/office/word/2010/wordprocessingGroup" xmlns:wpi="http://schemas.microsoft.com/office/word/2010/wordprocessingInk" xmlns:wne="http://schemas.microsoft.com/office/word/2006/wordml" xmlns:wps="http://schemas.microsoft.com/office/word/2010/wordprocessingShape" mc:Ignorable="w14 w15 w16se w16cid wp14">
+<w:numbering xmlns:wpc="http://schemas.microsoft.com/office/word/2010/wordprocessingCanvas" xmlns:cx="http://schemas.microsoft.com/office/drawing/2014/chartex" xmlns:cx1="http://schemas.microsoft.com/office/drawing/2015/9/8/chartex" xmlns:cx2="http://schemas.microsoft.com/office/drawing/2015/10/21/chartex" xmlns:cx3="http://schemas.microsoft.com/office/drawing/2016/5/9/chartex" xmlns:cx4="http://schemas.microsoft.com/office/drawing/2016/5/10/chartex" xmlns:cx5="http://schemas.microsoft.com/office/drawing/2016/5/11/chartex" xmlns:cx6="http://schemas.microsoft.com/office/drawing/2016/5/12/chartex" xmlns:cx7="http://schemas.microsoft.com/office/drawing/2016/5/13/chartex" xmlns:cx8="http://schemas.microsoft.com/office/drawing/2016/5/14/chartex" xmlns:mc="http://schemas.openxmlformats.org/markup-compatibility/2006" xmlns:aink="http://schemas.microsoft.com/office/drawing/2016/ink" xmlns:am3d="http://schemas.microsoft.com/office/drawing/2017/model3d" xmlns:o="urn:schemas-microsoft-com:office:office" xmlns:oel="http://schemas.microsoft.com/office/2019/extlst" xmlns:r="http://schemas.openxmlformats.org/officeDocument/2006/relationships" xmlns:m="http://schemas.openxmlformats.org/officeDocument/2006/math" xmlns:v="urn:schemas-microsoft-com:vml" xmlns:wp14="http://schemas.microsoft.com/office/word/2010/wordprocessingDrawing" xmlns:wp="http://schemas.openxmlformats.org/drawingml/2006/wordprocessingDrawing" xmlns:w10="urn:schemas-microsoft-com:office:word" xmlns:w="http://schemas.openxmlformats.org/wordprocessingml/2006/main" xmlns:w14="http://schemas.microsoft.com/office/word/2010/wordml" xmlns:w15="http://schemas.microsoft.com/office/word/2012/wordml" xmlns:w16cex="http://schemas.microsoft.com/office/word/2018/wordml/cex" xmlns:w16cid="http://schemas.microsoft.com/office/word/2016/wordml/cid" xmlns:w16="http://schemas.microsoft.com/office/word/2018/wordml" xmlns:w16du="http://schemas.microsoft.com/office/word/2023/wordml/word16du" xmlns:w16sdtdh="http://schemas.microsoft.com/office/word/2020/wordml/sdtdatahash" xmlns:w16sdtfl="http://schemas.microsoft.com/office/word/2024/wordml/sdtformatlock" xmlns:w16se="http://schemas.microsoft.com/office/word/2015/wordml/symex" xmlns:wpg="http://schemas.microsoft.com/office/word/2010/wordprocessingGroup" xmlns:wpi="http://schemas.microsoft.com/office/word/2010/wordprocessingInk" xmlns:wne="http://schemas.microsoft.com/office/word/2006/wordml" xmlns:wps="http://schemas.microsoft.com/office/word/2010/wordprocessingShape" mc:Ignorable="w14 w15 w16se w16cid w16 w16cex w16sdtdh w16sdtfl w16du wp14">
   <w:abstractNum w:abstractNumId="0" w15:restartNumberingAfterBreak="0">
     <w:nsid w:val="222B73A9"/>
     <w:multiLevelType w:val="hybridMultilevel"/>
@@ -2269,38 +1968,38 @@
       </w:rPr>
     </w:lvl>
   </w:abstractNum>
-  <w:num w:numId="1">
+  <w:num w:numId="1" w16cid:durableId="1791898692">
     <w:abstractNumId w:val="0"/>
   </w:num>
-  <w:num w:numId="2">
+  <w:num w:numId="2" w16cid:durableId="1775637408">
     <w:abstractNumId w:val="5"/>
   </w:num>
-  <w:num w:numId="3">
+  <w:num w:numId="3" w16cid:durableId="900991138">
     <w:abstractNumId w:val="7"/>
   </w:num>
-  <w:num w:numId="4">
+  <w:num w:numId="4" w16cid:durableId="884683390">
     <w:abstractNumId w:val="6"/>
   </w:num>
-  <w:num w:numId="5">
+  <w:num w:numId="5" w16cid:durableId="884365255">
     <w:abstractNumId w:val="1"/>
   </w:num>
-  <w:num w:numId="6">
+  <w:num w:numId="6" w16cid:durableId="1502769915">
     <w:abstractNumId w:val="3"/>
   </w:num>
-  <w:num w:numId="7">
+  <w:num w:numId="7" w16cid:durableId="704404976">
     <w:abstractNumId w:val="2"/>
   </w:num>
-  <w:num w:numId="8">
+  <w:num w:numId="8" w16cid:durableId="7562274">
     <w:abstractNumId w:val="8"/>
   </w:num>
-  <w:num w:numId="9">
+  <w:num w:numId="9" w16cid:durableId="1253467957">
     <w:abstractNumId w:val="4"/>
   </w:num>
 </w:numbering>
 </file>
 
 <file path=word/styles.xml><?xml version="1.0" encoding="utf-8"?>
-<w:styles xmlns:mc="http://schemas.openxmlformats.org/markup-compatibility/2006" xmlns:r="http://schemas.openxmlformats.org/officeDocument/2006/relationships" xmlns:w="http://schemas.openxmlformats.org/wordprocessingml/2006/main" xmlns:w14="http://schemas.microsoft.com/office/word/2010/wordml" xmlns:w15="http://schemas.microsoft.com/office/word/2012/wordml" xmlns:w16cid="http://schemas.microsoft.com/office/word/2016/wordml/cid" xmlns:w16se="http://schemas.microsoft.com/office/word/2015/wordml/symex" mc:Ignorable="w14 w15 w16se w16cid">
+<w:styles xmlns:mc="http://schemas.openxmlformats.org/markup-compatibility/2006" xmlns:r="http://schemas.openxmlformats.org/officeDocument/2006/relationships" xmlns:w="http://schemas.openxmlformats.org/wordprocessingml/2006/main" xmlns:w14="http://schemas.microsoft.com/office/word/2010/wordml" xmlns:w15="http://schemas.microsoft.com/office/word/2012/wordml" xmlns:w16cex="http://schemas.microsoft.com/office/word/2018/wordml/cex" xmlns:w16cid="http://schemas.microsoft.com/office/word/2016/wordml/cid" xmlns:w16="http://schemas.microsoft.com/office/word/2018/wordml" xmlns:w16du="http://schemas.microsoft.com/office/word/2023/wordml/word16du" xmlns:w16sdtdh="http://schemas.microsoft.com/office/word/2020/wordml/sdtdatahash" xmlns:w16sdtfl="http://schemas.microsoft.com/office/word/2024/wordml/sdtformatlock" xmlns:w16se="http://schemas.microsoft.com/office/word/2015/wordml/symex" mc:Ignorable="w14 w15 w16se w16cid w16 w16cex w16sdtdh w16sdtfl w16du">
   <w:docDefaults>
     <w:rPrDefault>
       <w:rPr>
@@ -2316,7 +2015,7 @@
       </w:pPr>
     </w:pPrDefault>
   </w:docDefaults>
-  <w:latentStyles w:defLockedState="0" w:defUIPriority="99" w:defSemiHidden="0" w:defUnhideWhenUsed="0" w:defQFormat="0" w:count="375">
+  <w:latentStyles w:defLockedState="0" w:defUIPriority="99" w:defSemiHidden="0" w:defUnhideWhenUsed="0" w:defQFormat="0" w:count="376">
     <w:lsdException w:name="Normal" w:uiPriority="0" w:qFormat="1"/>
     <w:lsdException w:name="heading 1" w:uiPriority="9" w:qFormat="1"/>
     <w:lsdException w:name="heading 2" w:semiHidden="1" w:uiPriority="9" w:unhideWhenUsed="1" w:qFormat="1"/>
@@ -2692,6 +2391,7 @@
     <w:lsdException w:name="Smart Hyperlink" w:semiHidden="1" w:unhideWhenUsed="1"/>
     <w:lsdException w:name="Hashtag" w:semiHidden="1" w:unhideWhenUsed="1"/>
     <w:lsdException w:name="Unresolved Mention" w:semiHidden="1" w:unhideWhenUsed="1"/>
+    <w:lsdException w:name="Smart Link" w:semiHidden="1" w:unhideWhenUsed="1"/>
   </w:latentStyles>
   <w:style w:type="paragraph" w:default="1" w:styleId="Normal">
     <w:name w:val="Normal"/>

</xml_diff>